<commit_message>
Refresh Cryptography and Image Analysis downloads: solution slides, chunked image analysis deck, cow_message_starter.py, booklets with answers, student zips
</commit_message>
<xml_diff>
--- a/static/teaching/a-level-y12-13-image-analysis-image-analysis-challenge/image-analysis-all-in-one.docx
+++ b/static/teaching/a-level-y12-13-image-analysis-image-analysis-challenge/image-analysis-all-in-one.docx
@@ -127,7 +127,7 @@
         <w:t>carry on to the next one</w:t>
       </w:r>
       <w:r>
-        <w:t>. Everything you need is in here. Do not wait for the class.</w:t>
+        <w:t>. Everything you need is in here. Do not wait for the class. The answers are on the last page, upside down. Try first, then check.</w:t>
       </w:r>
     </w:p>
     <w:p>
@@ -141,7 +141,7 @@
         <w:t>Hints come in two levels.</w:t>
       </w:r>
       <w:r>
-        <w:t xml:space="preserve"> Try it yourself first. If you are stuck, read Hint 1. Still stuck? Read Hint 2. The answer is never printed, because you can work it out.</w:t>
+        <w:t xml:space="preserve"> Try it yourself first. If you are stuck, read Hint 1. Still stuck? Read Hint 2. The answer is never printed, because you can work it out. The same Hint 1 and Hint 2 are also in the code file as comments, so use whichever is easier.</w:t>
       </w:r>
     </w:p>
     <w:tbl>
@@ -254,7 +254,7 @@
           <w:sz w:val="20"/>
           <w:shd w:val="clear" w:color="auto" w:fill="EEF2F7"/>
         </w:rPr>
-        <w:t>image_starter.py</w:t>
+        <w:t>cow_message_starter.py</w:t>
       </w:r>
       <w:r>
         <w:t xml:space="preserve">, </w:t>
@@ -1570,7 +1570,7 @@
               <w:rPr>
                 <w:b/>
               </w:rPr>
-              <w:t>in image_starter.py</w:t>
+              <w:t>in cow_message_starter.py</w:t>
             </w:r>
           </w:p>
         </w:tc>
@@ -8657,7 +8657,7 @@
                 <w:color w:val="FFFFFF"/>
                 <w:sz w:val="26"/>
               </w:rPr>
-              <w:t>Be the computer (optional paper warm-up)</w:t>
+              <w:t>Let the computer do it</w:t>
             </w:r>
           </w:p>
         </w:tc>
@@ -8673,1509 +8673,8 @@
         <w:spacing w:after="120" w:before="0"/>
       </w:pPr>
       <w:r>
-        <w:t xml:space="preserve">Do image 1 first, then 2 and 3 if you want to feel what the computer does. Add up the nine red numbers, take the total </w:t>
-      </w:r>
-      <w:r>
-        <w:rPr>
-          <w:rFonts w:ascii="Courier New" w:hAnsi="Courier New" w:eastAsia="Courier New" w:cs="Courier New"/>
-          <w:sz w:val="20"/>
-          <w:shd w:val="clear" w:color="auto" w:fill="EEF2F7"/>
-        </w:rPr>
-        <w:t>% 26</w:t>
-      </w:r>
-      <w:r>
-        <w:t xml:space="preserve"> (keep taking 26 off until you cannot), then find the letter.</w:t>
-      </w:r>
-    </w:p>
-    <w:tbl>
-      <w:tblPr>
-        <w:tblW w:type="dxa" w:w="7654"/>
-        <w:jc w:val="center"/>
-        <w:tblLayout w:type="fixed"/>
-        <w:tblLook w:firstColumn="1" w:firstRow="1" w:lastColumn="0" w:lastRow="0" w:noHBand="0" w:noVBand="1" w:val="04A0"/>
-        <w:tblLayout w:type="fixed"/>
-      </w:tblPr>
-      <w:tblGrid>
-        <w:gridCol w:w="737"/>
-        <w:gridCol w:w="737"/>
-        <w:gridCol w:w="737"/>
-        <w:gridCol w:w="510"/>
-        <w:gridCol w:w="737"/>
-        <w:gridCol w:w="737"/>
-        <w:gridCol w:w="737"/>
-        <w:gridCol w:w="510"/>
-        <w:gridCol w:w="737"/>
-        <w:gridCol w:w="737"/>
-        <w:gridCol w:w="737"/>
-      </w:tblGrid>
-      <w:tr>
-        <w:tc>
-          <w:tcPr>
-            <w:tcW w:type="dxa" w:w="2211"/>
-            <w:gridSpan w:val="3"/>
-            <w:tcBorders>
-              <w:top w:val="nil" w:space="0"/>
-              <w:left w:val="nil" w:space="0"/>
-              <w:bottom w:val="nil" w:space="0"/>
-              <w:right w:val="nil" w:space="0"/>
-            </w:tcBorders>
-          </w:tcPr>
-          <w:p>
-            <w:pPr>
-              <w:spacing w:after="60" w:before="0"/>
-              <w:jc w:val="center"/>
-            </w:pPr>
-            <w:r>
-              <w:rPr>
-                <w:b/>
-                <w:sz w:val="18"/>
-              </w:rPr>
-              <w:t>Image 1 (worked example)</w:t>
-            </w:r>
-          </w:p>
-        </w:tc>
-        <w:tc>
-          <w:tcPr>
-            <w:tcW w:type="dxa" w:w="510"/>
-            <w:tcBorders>
-              <w:top w:val="nil" w:space="0"/>
-              <w:left w:val="nil" w:space="0"/>
-              <w:bottom w:val="nil" w:space="0"/>
-              <w:right w:val="nil" w:space="0"/>
-            </w:tcBorders>
-          </w:tcPr>
-          <w:p/>
-        </w:tc>
-        <w:tc>
-          <w:tcPr>
-            <w:tcW w:type="dxa" w:w="2211"/>
-            <w:gridSpan w:val="3"/>
-            <w:tcBorders>
-              <w:top w:val="nil" w:space="0"/>
-              <w:left w:val="nil" w:space="0"/>
-              <w:bottom w:val="nil" w:space="0"/>
-              <w:right w:val="nil" w:space="0"/>
-            </w:tcBorders>
-          </w:tcPr>
-          <w:p>
-            <w:pPr>
-              <w:spacing w:after="60" w:before="0"/>
-              <w:jc w:val="center"/>
-            </w:pPr>
-            <w:r>
-              <w:rPr>
-                <w:b/>
-                <w:sz w:val="18"/>
-              </w:rPr>
-              <w:t>Image 2</w:t>
-            </w:r>
-          </w:p>
-        </w:tc>
-        <w:tc>
-          <w:tcPr>
-            <w:tcW w:type="dxa" w:w="510"/>
-            <w:tcBorders>
-              <w:top w:val="nil" w:space="0"/>
-              <w:left w:val="nil" w:space="0"/>
-              <w:bottom w:val="nil" w:space="0"/>
-              <w:right w:val="nil" w:space="0"/>
-            </w:tcBorders>
-          </w:tcPr>
-          <w:p/>
-        </w:tc>
-        <w:tc>
-          <w:tcPr>
-            <w:tcW w:type="dxa" w:w="2211"/>
-            <w:gridSpan w:val="3"/>
-            <w:tcBorders>
-              <w:top w:val="nil" w:space="0"/>
-              <w:left w:val="nil" w:space="0"/>
-              <w:bottom w:val="nil" w:space="0"/>
-              <w:right w:val="nil" w:space="0"/>
-            </w:tcBorders>
-          </w:tcPr>
-          <w:p>
-            <w:pPr>
-              <w:spacing w:after="60" w:before="0"/>
-              <w:jc w:val="center"/>
-            </w:pPr>
-            <w:r>
-              <w:rPr>
-                <w:b/>
-                <w:sz w:val="18"/>
-              </w:rPr>
-              <w:t>Image 3</w:t>
-            </w:r>
-          </w:p>
-        </w:tc>
-      </w:tr>
-      <w:tr>
-        <w:tc>
-          <w:tcPr>
-            <w:tcW w:type="dxa" w:w="737"/>
-            <w:tcBorders>
-              <w:top w:val="single" w:sz="6" w:color="000000" w:space="0"/>
-              <w:left w:val="single" w:sz="6" w:color="000000" w:space="0"/>
-              <w:bottom w:val="single" w:sz="6" w:color="000000" w:space="0"/>
-              <w:right w:val="single" w:sz="6" w:color="000000" w:space="0"/>
-            </w:tcBorders>
-            <w:tcMar>
-              <w:top w:w="25" w:type="dxa"/>
-              <w:left w:w="20" w:type="dxa"/>
-              <w:bottom w:w="25" w:type="dxa"/>
-              <w:right w:w="20" w:type="dxa"/>
-            </w:tcMar>
-          </w:tcPr>
-          <w:p>
-            <w:pPr>
-              <w:spacing w:after="0" w:before="0"/>
-              <w:jc w:val="center"/>
-            </w:pPr>
-            <w:r>
-              <w:rPr>
-                <w:sz w:val="19"/>
-              </w:rPr>
-              <w:t>60</w:t>
-            </w:r>
-          </w:p>
-        </w:tc>
-        <w:tc>
-          <w:tcPr>
-            <w:tcW w:type="dxa" w:w="737"/>
-            <w:tcBorders>
-              <w:top w:val="single" w:sz="6" w:color="000000" w:space="0"/>
-              <w:left w:val="single" w:sz="6" w:color="000000" w:space="0"/>
-              <w:bottom w:val="single" w:sz="6" w:color="000000" w:space="0"/>
-              <w:right w:val="single" w:sz="6" w:color="000000" w:space="0"/>
-            </w:tcBorders>
-            <w:tcMar>
-              <w:top w:w="25" w:type="dxa"/>
-              <w:left w:w="20" w:type="dxa"/>
-              <w:bottom w:w="25" w:type="dxa"/>
-              <w:right w:w="20" w:type="dxa"/>
-            </w:tcMar>
-          </w:tcPr>
-          <w:p>
-            <w:pPr>
-              <w:spacing w:after="0" w:before="0"/>
-              <w:jc w:val="center"/>
-            </w:pPr>
-            <w:r>
-              <w:rPr>
-                <w:sz w:val="19"/>
-              </w:rPr>
-              <w:t>58</w:t>
-            </w:r>
-          </w:p>
-        </w:tc>
-        <w:tc>
-          <w:tcPr>
-            <w:tcW w:type="dxa" w:w="737"/>
-            <w:tcBorders>
-              <w:top w:val="single" w:sz="6" w:color="000000" w:space="0"/>
-              <w:left w:val="single" w:sz="6" w:color="000000" w:space="0"/>
-              <w:bottom w:val="single" w:sz="6" w:color="000000" w:space="0"/>
-              <w:right w:val="single" w:sz="6" w:color="000000" w:space="0"/>
-            </w:tcBorders>
-            <w:tcMar>
-              <w:top w:w="25" w:type="dxa"/>
-              <w:left w:w="20" w:type="dxa"/>
-              <w:bottom w:w="25" w:type="dxa"/>
-              <w:right w:w="20" w:type="dxa"/>
-            </w:tcMar>
-          </w:tcPr>
-          <w:p>
-            <w:pPr>
-              <w:spacing w:after="0" w:before="0"/>
-              <w:jc w:val="center"/>
-            </w:pPr>
-            <w:r>
-              <w:rPr>
-                <w:sz w:val="19"/>
-              </w:rPr>
-              <w:t>146</w:t>
-            </w:r>
-          </w:p>
-        </w:tc>
-        <w:tc>
-          <w:tcPr>
-            <w:tcW w:type="dxa" w:w="510"/>
-            <w:tcBorders>
-              <w:top w:val="nil" w:space="0"/>
-              <w:left w:val="nil" w:space="0"/>
-              <w:bottom w:val="nil" w:space="0"/>
-              <w:right w:val="nil" w:space="0"/>
-            </w:tcBorders>
-          </w:tcPr>
-          <w:p/>
-        </w:tc>
-        <w:tc>
-          <w:tcPr>
-            <w:tcW w:type="dxa" w:w="737"/>
-            <w:tcBorders>
-              <w:top w:val="single" w:sz="6" w:color="000000" w:space="0"/>
-              <w:left w:val="single" w:sz="6" w:color="000000" w:space="0"/>
-              <w:bottom w:val="single" w:sz="6" w:color="000000" w:space="0"/>
-              <w:right w:val="single" w:sz="6" w:color="000000" w:space="0"/>
-            </w:tcBorders>
-            <w:tcMar>
-              <w:top w:w="25" w:type="dxa"/>
-              <w:left w:w="20" w:type="dxa"/>
-              <w:bottom w:w="25" w:type="dxa"/>
-              <w:right w:w="20" w:type="dxa"/>
-            </w:tcMar>
-          </w:tcPr>
-          <w:p>
-            <w:pPr>
-              <w:spacing w:after="0" w:before="0"/>
-              <w:jc w:val="center"/>
-            </w:pPr>
-            <w:r>
-              <w:rPr>
-                <w:sz w:val="19"/>
-              </w:rPr>
-              <w:t>48</w:t>
-            </w:r>
-          </w:p>
-        </w:tc>
-        <w:tc>
-          <w:tcPr>
-            <w:tcW w:type="dxa" w:w="737"/>
-            <w:tcBorders>
-              <w:top w:val="single" w:sz="6" w:color="000000" w:space="0"/>
-              <w:left w:val="single" w:sz="6" w:color="000000" w:space="0"/>
-              <w:bottom w:val="single" w:sz="6" w:color="000000" w:space="0"/>
-              <w:right w:val="single" w:sz="6" w:color="000000" w:space="0"/>
-            </w:tcBorders>
-            <w:tcMar>
-              <w:top w:w="25" w:type="dxa"/>
-              <w:left w:w="20" w:type="dxa"/>
-              <w:bottom w:w="25" w:type="dxa"/>
-              <w:right w:w="20" w:type="dxa"/>
-            </w:tcMar>
-          </w:tcPr>
-          <w:p>
-            <w:pPr>
-              <w:spacing w:after="0" w:before="0"/>
-              <w:jc w:val="center"/>
-            </w:pPr>
-            <w:r>
-              <w:rPr>
-                <w:sz w:val="19"/>
-              </w:rPr>
-              <w:t>212</w:t>
-            </w:r>
-          </w:p>
-        </w:tc>
-        <w:tc>
-          <w:tcPr>
-            <w:tcW w:type="dxa" w:w="737"/>
-            <w:tcBorders>
-              <w:top w:val="single" w:sz="6" w:color="000000" w:space="0"/>
-              <w:left w:val="single" w:sz="6" w:color="000000" w:space="0"/>
-              <w:bottom w:val="single" w:sz="6" w:color="000000" w:space="0"/>
-              <w:right w:val="single" w:sz="6" w:color="000000" w:space="0"/>
-            </w:tcBorders>
-            <w:tcMar>
-              <w:top w:w="25" w:type="dxa"/>
-              <w:left w:w="20" w:type="dxa"/>
-              <w:bottom w:w="25" w:type="dxa"/>
-              <w:right w:w="20" w:type="dxa"/>
-            </w:tcMar>
-          </w:tcPr>
-          <w:p>
-            <w:pPr>
-              <w:spacing w:after="0" w:before="0"/>
-              <w:jc w:val="center"/>
-            </w:pPr>
-            <w:r>
-              <w:rPr>
-                <w:sz w:val="19"/>
-              </w:rPr>
-              <w:t>202</w:t>
-            </w:r>
-          </w:p>
-        </w:tc>
-        <w:tc>
-          <w:tcPr>
-            <w:tcW w:type="dxa" w:w="510"/>
-            <w:tcBorders>
-              <w:top w:val="nil" w:space="0"/>
-              <w:left w:val="nil" w:space="0"/>
-              <w:bottom w:val="nil" w:space="0"/>
-              <w:right w:val="nil" w:space="0"/>
-            </w:tcBorders>
-          </w:tcPr>
-          <w:p/>
-        </w:tc>
-        <w:tc>
-          <w:tcPr>
-            <w:tcW w:type="dxa" w:w="737"/>
-            <w:tcBorders>
-              <w:top w:val="single" w:sz="6" w:color="000000" w:space="0"/>
-              <w:left w:val="single" w:sz="6" w:color="000000" w:space="0"/>
-              <w:bottom w:val="single" w:sz="6" w:color="000000" w:space="0"/>
-              <w:right w:val="single" w:sz="6" w:color="000000" w:space="0"/>
-            </w:tcBorders>
-            <w:tcMar>
-              <w:top w:w="25" w:type="dxa"/>
-              <w:left w:w="20" w:type="dxa"/>
-              <w:bottom w:w="25" w:type="dxa"/>
-              <w:right w:w="20" w:type="dxa"/>
-            </w:tcMar>
-          </w:tcPr>
-          <w:p>
-            <w:pPr>
-              <w:spacing w:after="0" w:before="0"/>
-              <w:jc w:val="center"/>
-            </w:pPr>
-            <w:r>
-              <w:rPr>
-                <w:sz w:val="19"/>
-              </w:rPr>
-              <w:t>44</w:t>
-            </w:r>
-          </w:p>
-        </w:tc>
-        <w:tc>
-          <w:tcPr>
-            <w:tcW w:type="dxa" w:w="737"/>
-            <w:tcBorders>
-              <w:top w:val="single" w:sz="6" w:color="000000" w:space="0"/>
-              <w:left w:val="single" w:sz="6" w:color="000000" w:space="0"/>
-              <w:bottom w:val="single" w:sz="6" w:color="000000" w:space="0"/>
-              <w:right w:val="single" w:sz="6" w:color="000000" w:space="0"/>
-            </w:tcBorders>
-            <w:tcMar>
-              <w:top w:w="25" w:type="dxa"/>
-              <w:left w:w="20" w:type="dxa"/>
-              <w:bottom w:w="25" w:type="dxa"/>
-              <w:right w:w="20" w:type="dxa"/>
-            </w:tcMar>
-          </w:tcPr>
-          <w:p>
-            <w:pPr>
-              <w:spacing w:after="0" w:before="0"/>
-              <w:jc w:val="center"/>
-            </w:pPr>
-            <w:r>
-              <w:rPr>
-                <w:sz w:val="19"/>
-              </w:rPr>
-              <w:t>180</w:t>
-            </w:r>
-          </w:p>
-        </w:tc>
-        <w:tc>
-          <w:tcPr>
-            <w:tcW w:type="dxa" w:w="737"/>
-            <w:tcBorders>
-              <w:top w:val="single" w:sz="6" w:color="000000" w:space="0"/>
-              <w:left w:val="single" w:sz="6" w:color="000000" w:space="0"/>
-              <w:bottom w:val="single" w:sz="6" w:color="000000" w:space="0"/>
-              <w:right w:val="single" w:sz="6" w:color="000000" w:space="0"/>
-            </w:tcBorders>
-            <w:tcMar>
-              <w:top w:w="25" w:type="dxa"/>
-              <w:left w:w="20" w:type="dxa"/>
-              <w:bottom w:w="25" w:type="dxa"/>
-              <w:right w:w="20" w:type="dxa"/>
-            </w:tcMar>
-          </w:tcPr>
-          <w:p>
-            <w:pPr>
-              <w:spacing w:after="0" w:before="0"/>
-              <w:jc w:val="center"/>
-            </w:pPr>
-            <w:r>
-              <w:rPr>
-                <w:sz w:val="19"/>
-              </w:rPr>
-              <w:t>113</w:t>
-            </w:r>
-          </w:p>
-        </w:tc>
-      </w:tr>
-      <w:tr>
-        <w:tc>
-          <w:tcPr>
-            <w:tcW w:type="dxa" w:w="737"/>
-            <w:tcBorders>
-              <w:top w:val="single" w:sz="6" w:color="000000" w:space="0"/>
-              <w:left w:val="single" w:sz="6" w:color="000000" w:space="0"/>
-              <w:bottom w:val="single" w:sz="6" w:color="000000" w:space="0"/>
-              <w:right w:val="single" w:sz="6" w:color="000000" w:space="0"/>
-            </w:tcBorders>
-            <w:tcMar>
-              <w:top w:w="25" w:type="dxa"/>
-              <w:left w:w="20" w:type="dxa"/>
-              <w:bottom w:w="25" w:type="dxa"/>
-              <w:right w:w="20" w:type="dxa"/>
-            </w:tcMar>
-          </w:tcPr>
-          <w:p>
-            <w:pPr>
-              <w:spacing w:after="0" w:before="0"/>
-              <w:jc w:val="center"/>
-            </w:pPr>
-            <w:r>
-              <w:rPr>
-                <w:sz w:val="19"/>
-              </w:rPr>
-              <w:t>179</w:t>
-            </w:r>
-          </w:p>
-        </w:tc>
-        <w:tc>
-          <w:tcPr>
-            <w:tcW w:type="dxa" w:w="737"/>
-            <w:tcBorders>
-              <w:top w:val="single" w:sz="6" w:color="000000" w:space="0"/>
-              <w:left w:val="single" w:sz="6" w:color="000000" w:space="0"/>
-              <w:bottom w:val="single" w:sz="6" w:color="000000" w:space="0"/>
-              <w:right w:val="single" w:sz="6" w:color="000000" w:space="0"/>
-            </w:tcBorders>
-            <w:tcMar>
-              <w:top w:w="25" w:type="dxa"/>
-              <w:left w:w="20" w:type="dxa"/>
-              <w:bottom w:w="25" w:type="dxa"/>
-              <w:right w:w="20" w:type="dxa"/>
-            </w:tcMar>
-          </w:tcPr>
-          <w:p>
-            <w:pPr>
-              <w:spacing w:after="0" w:before="0"/>
-              <w:jc w:val="center"/>
-            </w:pPr>
-            <w:r>
-              <w:rPr>
-                <w:sz w:val="19"/>
-              </w:rPr>
-              <w:t>176</w:t>
-            </w:r>
-          </w:p>
-        </w:tc>
-        <w:tc>
-          <w:tcPr>
-            <w:tcW w:type="dxa" w:w="737"/>
-            <w:tcBorders>
-              <w:top w:val="single" w:sz="6" w:color="000000" w:space="0"/>
-              <w:left w:val="single" w:sz="6" w:color="000000" w:space="0"/>
-              <w:bottom w:val="single" w:sz="6" w:color="000000" w:space="0"/>
-              <w:right w:val="single" w:sz="6" w:color="000000" w:space="0"/>
-            </w:tcBorders>
-            <w:tcMar>
-              <w:top w:w="25" w:type="dxa"/>
-              <w:left w:w="20" w:type="dxa"/>
-              <w:bottom w:w="25" w:type="dxa"/>
-              <w:right w:w="20" w:type="dxa"/>
-            </w:tcMar>
-          </w:tcPr>
-          <w:p>
-            <w:pPr>
-              <w:spacing w:after="0" w:before="0"/>
-              <w:jc w:val="center"/>
-            </w:pPr>
-            <w:r>
-              <w:rPr>
-                <w:sz w:val="19"/>
-              </w:rPr>
-              <w:t>119</w:t>
-            </w:r>
-          </w:p>
-        </w:tc>
-        <w:tc>
-          <w:tcPr>
-            <w:tcW w:type="dxa" w:w="510"/>
-            <w:tcBorders>
-              <w:top w:val="nil" w:space="0"/>
-              <w:left w:val="nil" w:space="0"/>
-              <w:bottom w:val="nil" w:space="0"/>
-              <w:right w:val="nil" w:space="0"/>
-            </w:tcBorders>
-          </w:tcPr>
-          <w:p/>
-        </w:tc>
-        <w:tc>
-          <w:tcPr>
-            <w:tcW w:type="dxa" w:w="737"/>
-            <w:tcBorders>
-              <w:top w:val="single" w:sz="6" w:color="000000" w:space="0"/>
-              <w:left w:val="single" w:sz="6" w:color="000000" w:space="0"/>
-              <w:bottom w:val="single" w:sz="6" w:color="000000" w:space="0"/>
-              <w:right w:val="single" w:sz="6" w:color="000000" w:space="0"/>
-            </w:tcBorders>
-            <w:tcMar>
-              <w:top w:w="25" w:type="dxa"/>
-              <w:left w:w="20" w:type="dxa"/>
-              <w:bottom w:w="25" w:type="dxa"/>
-              <w:right w:w="20" w:type="dxa"/>
-            </w:tcMar>
-          </w:tcPr>
-          <w:p>
-            <w:pPr>
-              <w:spacing w:after="0" w:before="0"/>
-              <w:jc w:val="center"/>
-            </w:pPr>
-            <w:r>
-              <w:rPr>
-                <w:sz w:val="19"/>
-              </w:rPr>
-              <w:t>35</w:t>
-            </w:r>
-          </w:p>
-        </w:tc>
-        <w:tc>
-          <w:tcPr>
-            <w:tcW w:type="dxa" w:w="737"/>
-            <w:tcBorders>
-              <w:top w:val="single" w:sz="6" w:color="000000" w:space="0"/>
-              <w:left w:val="single" w:sz="6" w:color="000000" w:space="0"/>
-              <w:bottom w:val="single" w:sz="6" w:color="000000" w:space="0"/>
-              <w:right w:val="single" w:sz="6" w:color="000000" w:space="0"/>
-            </w:tcBorders>
-            <w:tcMar>
-              <w:top w:w="25" w:type="dxa"/>
-              <w:left w:w="20" w:type="dxa"/>
-              <w:bottom w:w="25" w:type="dxa"/>
-              <w:right w:w="20" w:type="dxa"/>
-            </w:tcMar>
-          </w:tcPr>
-          <w:p>
-            <w:pPr>
-              <w:spacing w:after="0" w:before="0"/>
-              <w:jc w:val="center"/>
-            </w:pPr>
-            <w:r>
-              <w:rPr>
-                <w:sz w:val="19"/>
-              </w:rPr>
-              <w:t>126</w:t>
-            </w:r>
-          </w:p>
-        </w:tc>
-        <w:tc>
-          <w:tcPr>
-            <w:tcW w:type="dxa" w:w="737"/>
-            <w:tcBorders>
-              <w:top w:val="single" w:sz="6" w:color="000000" w:space="0"/>
-              <w:left w:val="single" w:sz="6" w:color="000000" w:space="0"/>
-              <w:bottom w:val="single" w:sz="6" w:color="000000" w:space="0"/>
-              <w:right w:val="single" w:sz="6" w:color="000000" w:space="0"/>
-            </w:tcBorders>
-            <w:tcMar>
-              <w:top w:w="25" w:type="dxa"/>
-              <w:left w:w="20" w:type="dxa"/>
-              <w:bottom w:w="25" w:type="dxa"/>
-              <w:right w:w="20" w:type="dxa"/>
-            </w:tcMar>
-          </w:tcPr>
-          <w:p>
-            <w:pPr>
-              <w:spacing w:after="0" w:before="0"/>
-              <w:jc w:val="center"/>
-            </w:pPr>
-            <w:r>
-              <w:rPr>
-                <w:sz w:val="19"/>
-              </w:rPr>
-              <w:t>187</w:t>
-            </w:r>
-          </w:p>
-        </w:tc>
-        <w:tc>
-          <w:tcPr>
-            <w:tcW w:type="dxa" w:w="510"/>
-            <w:tcBorders>
-              <w:top w:val="nil" w:space="0"/>
-              <w:left w:val="nil" w:space="0"/>
-              <w:bottom w:val="nil" w:space="0"/>
-              <w:right w:val="nil" w:space="0"/>
-            </w:tcBorders>
-          </w:tcPr>
-          <w:p/>
-        </w:tc>
-        <w:tc>
-          <w:tcPr>
-            <w:tcW w:type="dxa" w:w="737"/>
-            <w:tcBorders>
-              <w:top w:val="single" w:sz="6" w:color="000000" w:space="0"/>
-              <w:left w:val="single" w:sz="6" w:color="000000" w:space="0"/>
-              <w:bottom w:val="single" w:sz="6" w:color="000000" w:space="0"/>
-              <w:right w:val="single" w:sz="6" w:color="000000" w:space="0"/>
-            </w:tcBorders>
-            <w:tcMar>
-              <w:top w:w="25" w:type="dxa"/>
-              <w:left w:w="20" w:type="dxa"/>
-              <w:bottom w:w="25" w:type="dxa"/>
-              <w:right w:w="20" w:type="dxa"/>
-            </w:tcMar>
-          </w:tcPr>
-          <w:p>
-            <w:pPr>
-              <w:spacing w:after="0" w:before="0"/>
-              <w:jc w:val="center"/>
-            </w:pPr>
-            <w:r>
-              <w:rPr>
-                <w:sz w:val="19"/>
-              </w:rPr>
-              <w:t>178</w:t>
-            </w:r>
-          </w:p>
-        </w:tc>
-        <w:tc>
-          <w:tcPr>
-            <w:tcW w:type="dxa" w:w="737"/>
-            <w:tcBorders>
-              <w:top w:val="single" w:sz="6" w:color="000000" w:space="0"/>
-              <w:left w:val="single" w:sz="6" w:color="000000" w:space="0"/>
-              <w:bottom w:val="single" w:sz="6" w:color="000000" w:space="0"/>
-              <w:right w:val="single" w:sz="6" w:color="000000" w:space="0"/>
-            </w:tcBorders>
-            <w:tcMar>
-              <w:top w:w="25" w:type="dxa"/>
-              <w:left w:w="20" w:type="dxa"/>
-              <w:bottom w:w="25" w:type="dxa"/>
-              <w:right w:w="20" w:type="dxa"/>
-            </w:tcMar>
-          </w:tcPr>
-          <w:p>
-            <w:pPr>
-              <w:spacing w:after="0" w:before="0"/>
-              <w:jc w:val="center"/>
-            </w:pPr>
-            <w:r>
-              <w:rPr>
-                <w:sz w:val="19"/>
-              </w:rPr>
-              <w:t>98</w:t>
-            </w:r>
-          </w:p>
-        </w:tc>
-        <w:tc>
-          <w:tcPr>
-            <w:tcW w:type="dxa" w:w="737"/>
-            <w:tcBorders>
-              <w:top w:val="single" w:sz="6" w:color="000000" w:space="0"/>
-              <w:left w:val="single" w:sz="6" w:color="000000" w:space="0"/>
-              <w:bottom w:val="single" w:sz="6" w:color="000000" w:space="0"/>
-              <w:right w:val="single" w:sz="6" w:color="000000" w:space="0"/>
-            </w:tcBorders>
-            <w:tcMar>
-              <w:top w:w="25" w:type="dxa"/>
-              <w:left w:w="20" w:type="dxa"/>
-              <w:bottom w:w="25" w:type="dxa"/>
-              <w:right w:w="20" w:type="dxa"/>
-            </w:tcMar>
-          </w:tcPr>
-          <w:p>
-            <w:pPr>
-              <w:spacing w:after="0" w:before="0"/>
-              <w:jc w:val="center"/>
-            </w:pPr>
-            <w:r>
-              <w:rPr>
-                <w:sz w:val="19"/>
-              </w:rPr>
-              <w:t>155</w:t>
-            </w:r>
-          </w:p>
-        </w:tc>
-      </w:tr>
-      <w:tr>
-        <w:tc>
-          <w:tcPr>
-            <w:tcW w:type="dxa" w:w="737"/>
-            <w:tcBorders>
-              <w:top w:val="single" w:sz="6" w:color="000000" w:space="0"/>
-              <w:left w:val="single" w:sz="6" w:color="000000" w:space="0"/>
-              <w:bottom w:val="single" w:sz="6" w:color="000000" w:space="0"/>
-              <w:right w:val="single" w:sz="6" w:color="000000" w:space="0"/>
-            </w:tcBorders>
-            <w:tcMar>
-              <w:top w:w="25" w:type="dxa"/>
-              <w:left w:w="20" w:type="dxa"/>
-              <w:bottom w:w="25" w:type="dxa"/>
-              <w:right w:w="20" w:type="dxa"/>
-            </w:tcMar>
-          </w:tcPr>
-          <w:p>
-            <w:pPr>
-              <w:spacing w:after="0" w:before="0"/>
-              <w:jc w:val="center"/>
-            </w:pPr>
-            <w:r>
-              <w:rPr>
-                <w:sz w:val="19"/>
-              </w:rPr>
-              <w:t>164</w:t>
-            </w:r>
-          </w:p>
-        </w:tc>
-        <w:tc>
-          <w:tcPr>
-            <w:tcW w:type="dxa" w:w="737"/>
-            <w:tcBorders>
-              <w:top w:val="single" w:sz="6" w:color="000000" w:space="0"/>
-              <w:left w:val="single" w:sz="6" w:color="000000" w:space="0"/>
-              <w:bottom w:val="single" w:sz="6" w:color="000000" w:space="0"/>
-              <w:right w:val="single" w:sz="6" w:color="000000" w:space="0"/>
-            </w:tcBorders>
-            <w:tcMar>
-              <w:top w:w="25" w:type="dxa"/>
-              <w:left w:w="20" w:type="dxa"/>
-              <w:bottom w:w="25" w:type="dxa"/>
-              <w:right w:w="20" w:type="dxa"/>
-            </w:tcMar>
-          </w:tcPr>
-          <w:p>
-            <w:pPr>
-              <w:spacing w:after="0" w:before="0"/>
-              <w:jc w:val="center"/>
-            </w:pPr>
-            <w:r>
-              <w:rPr>
-                <w:sz w:val="19"/>
-              </w:rPr>
-              <w:t>185</w:t>
-            </w:r>
-          </w:p>
-        </w:tc>
-        <w:tc>
-          <w:tcPr>
-            <w:tcW w:type="dxa" w:w="737"/>
-            <w:tcBorders>
-              <w:top w:val="single" w:sz="6" w:color="000000" w:space="0"/>
-              <w:left w:val="single" w:sz="6" w:color="000000" w:space="0"/>
-              <w:bottom w:val="single" w:sz="6" w:color="000000" w:space="0"/>
-              <w:right w:val="single" w:sz="6" w:color="000000" w:space="0"/>
-            </w:tcBorders>
-            <w:tcMar>
-              <w:top w:w="25" w:type="dxa"/>
-              <w:left w:w="20" w:type="dxa"/>
-              <w:bottom w:w="25" w:type="dxa"/>
-              <w:right w:w="20" w:type="dxa"/>
-            </w:tcMar>
-          </w:tcPr>
-          <w:p>
-            <w:pPr>
-              <w:spacing w:after="0" w:before="0"/>
-              <w:jc w:val="center"/>
-            </w:pPr>
-            <w:r>
-              <w:rPr>
-                <w:sz w:val="19"/>
-              </w:rPr>
-              <w:t>85</w:t>
-            </w:r>
-          </w:p>
-        </w:tc>
-        <w:tc>
-          <w:tcPr>
-            <w:tcW w:type="dxa" w:w="510"/>
-            <w:tcBorders>
-              <w:top w:val="nil" w:space="0"/>
-              <w:left w:val="nil" w:space="0"/>
-              <w:bottom w:val="nil" w:space="0"/>
-              <w:right w:val="nil" w:space="0"/>
-            </w:tcBorders>
-          </w:tcPr>
-          <w:p/>
-        </w:tc>
-        <w:tc>
-          <w:tcPr>
-            <w:tcW w:type="dxa" w:w="737"/>
-            <w:tcBorders>
-              <w:top w:val="single" w:sz="6" w:color="000000" w:space="0"/>
-              <w:left w:val="single" w:sz="6" w:color="000000" w:space="0"/>
-              <w:bottom w:val="single" w:sz="6" w:color="000000" w:space="0"/>
-              <w:right w:val="single" w:sz="6" w:color="000000" w:space="0"/>
-            </w:tcBorders>
-            <w:tcMar>
-              <w:top w:w="25" w:type="dxa"/>
-              <w:left w:w="20" w:type="dxa"/>
-              <w:bottom w:w="25" w:type="dxa"/>
-              <w:right w:w="20" w:type="dxa"/>
-            </w:tcMar>
-          </w:tcPr>
-          <w:p>
-            <w:pPr>
-              <w:spacing w:after="0" w:before="0"/>
-              <w:jc w:val="center"/>
-            </w:pPr>
-            <w:r>
-              <w:rPr>
-                <w:sz w:val="19"/>
-              </w:rPr>
-              <w:t>177</w:t>
-            </w:r>
-          </w:p>
-        </w:tc>
-        <w:tc>
-          <w:tcPr>
-            <w:tcW w:type="dxa" w:w="737"/>
-            <w:tcBorders>
-              <w:top w:val="single" w:sz="6" w:color="000000" w:space="0"/>
-              <w:left w:val="single" w:sz="6" w:color="000000" w:space="0"/>
-              <w:bottom w:val="single" w:sz="6" w:color="000000" w:space="0"/>
-              <w:right w:val="single" w:sz="6" w:color="000000" w:space="0"/>
-            </w:tcBorders>
-            <w:tcMar>
-              <w:top w:w="25" w:type="dxa"/>
-              <w:left w:w="20" w:type="dxa"/>
-              <w:bottom w:w="25" w:type="dxa"/>
-              <w:right w:w="20" w:type="dxa"/>
-            </w:tcMar>
-          </w:tcPr>
-          <w:p>
-            <w:pPr>
-              <w:spacing w:after="0" w:before="0"/>
-              <w:jc w:val="center"/>
-            </w:pPr>
-            <w:r>
-              <w:rPr>
-                <w:sz w:val="19"/>
-              </w:rPr>
-              <w:t>61</w:t>
-            </w:r>
-          </w:p>
-        </w:tc>
-        <w:tc>
-          <w:tcPr>
-            <w:tcW w:type="dxa" w:w="737"/>
-            <w:tcBorders>
-              <w:top w:val="single" w:sz="6" w:color="000000" w:space="0"/>
-              <w:left w:val="single" w:sz="6" w:color="000000" w:space="0"/>
-              <w:bottom w:val="single" w:sz="6" w:color="000000" w:space="0"/>
-              <w:right w:val="single" w:sz="6" w:color="000000" w:space="0"/>
-            </w:tcBorders>
-            <w:tcMar>
-              <w:top w:w="25" w:type="dxa"/>
-              <w:left w:w="20" w:type="dxa"/>
-              <w:bottom w:w="25" w:type="dxa"/>
-              <w:right w:w="20" w:type="dxa"/>
-            </w:tcMar>
-          </w:tcPr>
-          <w:p>
-            <w:pPr>
-              <w:spacing w:after="0" w:before="0"/>
-              <w:jc w:val="center"/>
-            </w:pPr>
-            <w:r>
-              <w:rPr>
-                <w:sz w:val="19"/>
-              </w:rPr>
-              <w:t>162</w:t>
-            </w:r>
-          </w:p>
-        </w:tc>
-        <w:tc>
-          <w:tcPr>
-            <w:tcW w:type="dxa" w:w="510"/>
-            <w:tcBorders>
-              <w:top w:val="nil" w:space="0"/>
-              <w:left w:val="nil" w:space="0"/>
-              <w:bottom w:val="nil" w:space="0"/>
-              <w:right w:val="nil" w:space="0"/>
-            </w:tcBorders>
-          </w:tcPr>
-          <w:p/>
-        </w:tc>
-        <w:tc>
-          <w:tcPr>
-            <w:tcW w:type="dxa" w:w="737"/>
-            <w:tcBorders>
-              <w:top w:val="single" w:sz="6" w:color="000000" w:space="0"/>
-              <w:left w:val="single" w:sz="6" w:color="000000" w:space="0"/>
-              <w:bottom w:val="single" w:sz="6" w:color="000000" w:space="0"/>
-              <w:right w:val="single" w:sz="6" w:color="000000" w:space="0"/>
-            </w:tcBorders>
-            <w:tcMar>
-              <w:top w:w="25" w:type="dxa"/>
-              <w:left w:w="20" w:type="dxa"/>
-              <w:bottom w:w="25" w:type="dxa"/>
-              <w:right w:w="20" w:type="dxa"/>
-            </w:tcMar>
-          </w:tcPr>
-          <w:p>
-            <w:pPr>
-              <w:spacing w:after="0" w:before="0"/>
-              <w:jc w:val="center"/>
-            </w:pPr>
-            <w:r>
-              <w:rPr>
-                <w:sz w:val="19"/>
-              </w:rPr>
-              <w:t>165</w:t>
-            </w:r>
-          </w:p>
-        </w:tc>
-        <w:tc>
-          <w:tcPr>
-            <w:tcW w:type="dxa" w:w="737"/>
-            <w:tcBorders>
-              <w:top w:val="single" w:sz="6" w:color="000000" w:space="0"/>
-              <w:left w:val="single" w:sz="6" w:color="000000" w:space="0"/>
-              <w:bottom w:val="single" w:sz="6" w:color="000000" w:space="0"/>
-              <w:right w:val="single" w:sz="6" w:color="000000" w:space="0"/>
-            </w:tcBorders>
-            <w:tcMar>
-              <w:top w:w="25" w:type="dxa"/>
-              <w:left w:w="20" w:type="dxa"/>
-              <w:bottom w:w="25" w:type="dxa"/>
-              <w:right w:w="20" w:type="dxa"/>
-            </w:tcMar>
-          </w:tcPr>
-          <w:p>
-            <w:pPr>
-              <w:spacing w:after="0" w:before="0"/>
-              <w:jc w:val="center"/>
-            </w:pPr>
-            <w:r>
-              <w:rPr>
-                <w:sz w:val="19"/>
-              </w:rPr>
-              <w:t>160</w:t>
-            </w:r>
-          </w:p>
-        </w:tc>
-        <w:tc>
-          <w:tcPr>
-            <w:tcW w:type="dxa" w:w="737"/>
-            <w:tcBorders>
-              <w:top w:val="single" w:sz="6" w:color="000000" w:space="0"/>
-              <w:left w:val="single" w:sz="6" w:color="000000" w:space="0"/>
-              <w:bottom w:val="single" w:sz="6" w:color="000000" w:space="0"/>
-              <w:right w:val="single" w:sz="6" w:color="000000" w:space="0"/>
-            </w:tcBorders>
-            <w:tcMar>
-              <w:top w:w="25" w:type="dxa"/>
-              <w:left w:w="20" w:type="dxa"/>
-              <w:bottom w:w="25" w:type="dxa"/>
-              <w:right w:w="20" w:type="dxa"/>
-            </w:tcMar>
-          </w:tcPr>
-          <w:p>
-            <w:pPr>
-              <w:spacing w:after="0" w:before="0"/>
-              <w:jc w:val="center"/>
-            </w:pPr>
-            <w:r>
-              <w:rPr>
-                <w:sz w:val="19"/>
-              </w:rPr>
-              <w:t>47</w:t>
-            </w:r>
-          </w:p>
-        </w:tc>
-      </w:tr>
-    </w:tbl>
-    <w:p>
-      <w:pPr>
-        <w:spacing w:after="0" w:before="0" w:lineRule="exact" w:line="240"/>
-      </w:pPr>
-    </w:p>
-    <w:tbl>
-      <w:tblPr>
-        <w:tblW w:type="dxa" w:w="10206"/>
-        <w:jc w:val="center"/>
-        <w:tblLayout w:type="fixed"/>
-        <w:tblLook w:firstColumn="1" w:firstRow="1" w:lastColumn="0" w:lastRow="0" w:noHBand="0" w:noVBand="1" w:val="04A0"/>
-        <w:tblLayout w:type="fixed"/>
-      </w:tblPr>
-      <w:tblGrid>
-        <w:gridCol w:w="1247"/>
-        <w:gridCol w:w="3118"/>
-        <w:gridCol w:w="3572"/>
-        <w:gridCol w:w="2268"/>
-      </w:tblGrid>
-      <w:tr>
-        <w:tc>
-          <w:tcPr>
-            <w:tcW w:type="dxa" w:w="1247"/>
-            <w:tcBorders>
-              <w:top w:val="single" w:sz="6" w:color="002D6A" w:space="0"/>
-              <w:left w:val="single" w:sz="6" w:color="002D6A" w:space="0"/>
-              <w:bottom w:val="single" w:sz="6" w:color="002D6A" w:space="0"/>
-              <w:right w:val="single" w:sz="6" w:color="002D6A" w:space="0"/>
-            </w:tcBorders>
-            <w:shd w:val="clear" w:color="auto" w:fill="002D6A"/>
-          </w:tcPr>
-          <w:p>
-            <w:pPr>
-              <w:spacing w:after="0" w:before="0"/>
-            </w:pPr>
-            <w:r>
-              <w:rPr>
-                <w:b/>
-                <w:color w:val="FFFFFF"/>
-                <w:sz w:val="19"/>
-              </w:rPr>
-            </w:r>
-          </w:p>
-        </w:tc>
-        <w:tc>
-          <w:tcPr>
-            <w:tcW w:type="dxa" w:w="3118"/>
-            <w:tcBorders>
-              <w:top w:val="single" w:sz="6" w:color="002D6A" w:space="0"/>
-              <w:left w:val="single" w:sz="6" w:color="002D6A" w:space="0"/>
-              <w:bottom w:val="single" w:sz="6" w:color="002D6A" w:space="0"/>
-              <w:right w:val="single" w:sz="6" w:color="002D6A" w:space="0"/>
-            </w:tcBorders>
-            <w:shd w:val="clear" w:color="auto" w:fill="002D6A"/>
-          </w:tcPr>
-          <w:p>
-            <w:pPr>
-              <w:spacing w:after="0" w:before="0"/>
-            </w:pPr>
-            <w:r>
-              <w:rPr>
-                <w:b/>
-                <w:color w:val="FFFFFF"/>
-                <w:sz w:val="19"/>
-              </w:rPr>
-              <w:t>Total of the 9 numbers</w:t>
-            </w:r>
-          </w:p>
-        </w:tc>
-        <w:tc>
-          <w:tcPr>
-            <w:tcW w:type="dxa" w:w="3572"/>
-            <w:tcBorders>
-              <w:top w:val="single" w:sz="6" w:color="002D6A" w:space="0"/>
-              <w:left w:val="single" w:sz="6" w:color="002D6A" w:space="0"/>
-              <w:bottom w:val="single" w:sz="6" w:color="002D6A" w:space="0"/>
-              <w:right w:val="single" w:sz="6" w:color="002D6A" w:space="0"/>
-            </w:tcBorders>
-            <w:shd w:val="clear" w:color="auto" w:fill="002D6A"/>
-          </w:tcPr>
-          <w:p>
-            <w:pPr>
-              <w:spacing w:after="0" w:before="0"/>
-            </w:pPr>
-            <w:r>
-              <w:rPr>
-                <w:b/>
-                <w:color w:val="FFFFFF"/>
-                <w:sz w:val="19"/>
-              </w:rPr>
-              <w:t>Total % 26</w:t>
-            </w:r>
-          </w:p>
-        </w:tc>
-        <w:tc>
-          <w:tcPr>
-            <w:tcW w:type="dxa" w:w="2268"/>
-            <w:tcBorders>
-              <w:top w:val="single" w:sz="6" w:color="002D6A" w:space="0"/>
-              <w:left w:val="single" w:sz="6" w:color="002D6A" w:space="0"/>
-              <w:bottom w:val="single" w:sz="6" w:color="002D6A" w:space="0"/>
-              <w:right w:val="single" w:sz="6" w:color="002D6A" w:space="0"/>
-            </w:tcBorders>
-            <w:shd w:val="clear" w:color="auto" w:fill="002D6A"/>
-          </w:tcPr>
-          <w:p>
-            <w:pPr>
-              <w:spacing w:after="0" w:before="0"/>
-            </w:pPr>
-            <w:r>
-              <w:rPr>
-                <w:b/>
-                <w:color w:val="FFFFFF"/>
-                <w:sz w:val="19"/>
-              </w:rPr>
-              <w:t>Letter</w:t>
-            </w:r>
-          </w:p>
-        </w:tc>
-      </w:tr>
-      <w:tr>
-        <w:trPr>
-          <w:trHeight w:val="652" w:hRule="atLeast"/>
-        </w:trPr>
-        <w:tc>
-          <w:tcPr>
-            <w:tcW w:type="dxa" w:w="1247"/>
-            <w:tcBorders>
-              <w:top w:val="single" w:sz="6" w:color="002D6A" w:space="0"/>
-              <w:left w:val="single" w:sz="6" w:color="002D6A" w:space="0"/>
-              <w:bottom w:val="single" w:sz="6" w:color="002D6A" w:space="0"/>
-              <w:right w:val="single" w:sz="6" w:color="002D6A" w:space="0"/>
-            </w:tcBorders>
-            <w:vAlign w:val="center"/>
-          </w:tcPr>
-          <w:p>
-            <w:pPr>
-              <w:spacing w:after="0" w:before="0"/>
-            </w:pPr>
-            <w:r>
-              <w:rPr>
-                <w:sz w:val="20"/>
-              </w:rPr>
-              <w:t>Image 1</w:t>
-            </w:r>
-          </w:p>
-        </w:tc>
-        <w:tc>
-          <w:tcPr>
-            <w:tcW w:type="dxa" w:w="3118"/>
-            <w:tcBorders>
-              <w:top w:val="single" w:sz="6" w:color="002D6A" w:space="0"/>
-              <w:left w:val="single" w:sz="6" w:color="002D6A" w:space="0"/>
-              <w:bottom w:val="single" w:sz="6" w:color="002D6A" w:space="0"/>
-              <w:right w:val="single" w:sz="6" w:color="002D6A" w:space="0"/>
-            </w:tcBorders>
-            <w:vAlign w:val="center"/>
-          </w:tcPr>
-          <w:p>
-            <w:pPr>
-              <w:spacing w:after="0" w:before="0"/>
-            </w:pPr>
-            <w:r>
-              <w:rPr>
-                <w:sz w:val="20"/>
-              </w:rPr>
-              <w:t>1172</w:t>
-            </w:r>
-          </w:p>
-        </w:tc>
-        <w:tc>
-          <w:tcPr>
-            <w:tcW w:type="dxa" w:w="3572"/>
-            <w:tcBorders>
-              <w:top w:val="single" w:sz="6" w:color="002D6A" w:space="0"/>
-              <w:left w:val="single" w:sz="6" w:color="002D6A" w:space="0"/>
-              <w:bottom w:val="single" w:sz="6" w:color="002D6A" w:space="0"/>
-              <w:right w:val="single" w:sz="6" w:color="002D6A" w:space="0"/>
-            </w:tcBorders>
-            <w:vAlign w:val="center"/>
-          </w:tcPr>
-          <w:p>
-            <w:pPr>
-              <w:spacing w:after="0" w:before="0"/>
-            </w:pPr>
-            <w:r>
-              <w:rPr>
-                <w:sz w:val="20"/>
-              </w:rPr>
-              <w:t>2  (1172 − 26 × 45)</w:t>
-            </w:r>
-          </w:p>
-        </w:tc>
-        <w:tc>
-          <w:tcPr>
-            <w:tcW w:type="dxa" w:w="2268"/>
-            <w:tcBorders>
-              <w:top w:val="single" w:sz="6" w:color="002D6A" w:space="0"/>
-              <w:left w:val="single" w:sz="6" w:color="002D6A" w:space="0"/>
-              <w:bottom w:val="single" w:sz="6" w:color="002D6A" w:space="0"/>
-              <w:right w:val="single" w:sz="6" w:color="002D6A" w:space="0"/>
-            </w:tcBorders>
-            <w:vAlign w:val="center"/>
-          </w:tcPr>
-          <w:p>
-            <w:pPr>
-              <w:spacing w:after="0" w:before="0"/>
-            </w:pPr>
-            <w:r>
-              <w:rPr>
-                <w:sz w:val="20"/>
-              </w:rPr>
-              <w:t>C</w:t>
-            </w:r>
-          </w:p>
-        </w:tc>
-      </w:tr>
-      <w:tr>
-        <w:trPr>
-          <w:trHeight w:val="652" w:hRule="atLeast"/>
-        </w:trPr>
-        <w:tc>
-          <w:tcPr>
-            <w:tcW w:type="dxa" w:w="1247"/>
-            <w:tcBorders>
-              <w:top w:val="single" w:sz="6" w:color="002D6A" w:space="0"/>
-              <w:left w:val="single" w:sz="6" w:color="002D6A" w:space="0"/>
-              <w:bottom w:val="single" w:sz="6" w:color="002D6A" w:space="0"/>
-              <w:right w:val="single" w:sz="6" w:color="002D6A" w:space="0"/>
-            </w:tcBorders>
-            <w:vAlign w:val="center"/>
-          </w:tcPr>
-          <w:p>
-            <w:pPr>
-              <w:spacing w:after="0" w:before="0"/>
-            </w:pPr>
-            <w:r>
-              <w:rPr>
-                <w:sz w:val="20"/>
-              </w:rPr>
-              <w:t>Image 2</w:t>
-            </w:r>
-          </w:p>
-        </w:tc>
-        <w:tc>
-          <w:tcPr>
-            <w:tcW w:type="dxa" w:w="3118"/>
-            <w:tcBorders>
-              <w:top w:val="single" w:sz="6" w:color="002D6A" w:space="0"/>
-              <w:left w:val="single" w:sz="6" w:color="002D6A" w:space="0"/>
-              <w:bottom w:val="single" w:sz="6" w:color="002D6A" w:space="0"/>
-              <w:right w:val="single" w:sz="6" w:color="002D6A" w:space="0"/>
-            </w:tcBorders>
-            <w:vAlign w:val="center"/>
-          </w:tcPr>
-          <w:p>
-            <w:pPr>
-              <w:spacing w:after="0" w:before="0"/>
-            </w:pPr>
-            <w:r>
-              <w:rPr>
-                <w:sz w:val="20"/>
-              </w:rPr>
-            </w:r>
-          </w:p>
-        </w:tc>
-        <w:tc>
-          <w:tcPr>
-            <w:tcW w:type="dxa" w:w="3572"/>
-            <w:tcBorders>
-              <w:top w:val="single" w:sz="6" w:color="002D6A" w:space="0"/>
-              <w:left w:val="single" w:sz="6" w:color="002D6A" w:space="0"/>
-              <w:bottom w:val="single" w:sz="6" w:color="002D6A" w:space="0"/>
-              <w:right w:val="single" w:sz="6" w:color="002D6A" w:space="0"/>
-            </w:tcBorders>
-            <w:vAlign w:val="center"/>
-          </w:tcPr>
-          <w:p>
-            <w:pPr>
-              <w:spacing w:after="0" w:before="0"/>
-            </w:pPr>
-            <w:r>
-              <w:rPr>
-                <w:sz w:val="20"/>
-              </w:rPr>
-            </w:r>
-          </w:p>
-        </w:tc>
-        <w:tc>
-          <w:tcPr>
-            <w:tcW w:type="dxa" w:w="2268"/>
-            <w:tcBorders>
-              <w:top w:val="single" w:sz="6" w:color="002D6A" w:space="0"/>
-              <w:left w:val="single" w:sz="6" w:color="002D6A" w:space="0"/>
-              <w:bottom w:val="single" w:sz="6" w:color="002D6A" w:space="0"/>
-              <w:right w:val="single" w:sz="6" w:color="002D6A" w:space="0"/>
-            </w:tcBorders>
-            <w:vAlign w:val="center"/>
-          </w:tcPr>
-          <w:p>
-            <w:pPr>
-              <w:spacing w:after="0" w:before="0"/>
-            </w:pPr>
-            <w:r>
-              <w:rPr>
-                <w:sz w:val="20"/>
-              </w:rPr>
-            </w:r>
-          </w:p>
-        </w:tc>
-      </w:tr>
-      <w:tr>
-        <w:trPr>
-          <w:trHeight w:val="652" w:hRule="atLeast"/>
-        </w:trPr>
-        <w:tc>
-          <w:tcPr>
-            <w:tcW w:type="dxa" w:w="1247"/>
-            <w:tcBorders>
-              <w:top w:val="single" w:sz="6" w:color="002D6A" w:space="0"/>
-              <w:left w:val="single" w:sz="6" w:color="002D6A" w:space="0"/>
-              <w:bottom w:val="single" w:sz="6" w:color="002D6A" w:space="0"/>
-              <w:right w:val="single" w:sz="6" w:color="002D6A" w:space="0"/>
-            </w:tcBorders>
-            <w:vAlign w:val="center"/>
-          </w:tcPr>
-          <w:p>
-            <w:pPr>
-              <w:spacing w:after="0" w:before="0"/>
-            </w:pPr>
-            <w:r>
-              <w:rPr>
-                <w:sz w:val="20"/>
-              </w:rPr>
-              <w:t>Image 3</w:t>
-            </w:r>
-          </w:p>
-        </w:tc>
-        <w:tc>
-          <w:tcPr>
-            <w:tcW w:type="dxa" w:w="3118"/>
-            <w:tcBorders>
-              <w:top w:val="single" w:sz="6" w:color="002D6A" w:space="0"/>
-              <w:left w:val="single" w:sz="6" w:color="002D6A" w:space="0"/>
-              <w:bottom w:val="single" w:sz="6" w:color="002D6A" w:space="0"/>
-              <w:right w:val="single" w:sz="6" w:color="002D6A" w:space="0"/>
-            </w:tcBorders>
-            <w:vAlign w:val="center"/>
-          </w:tcPr>
-          <w:p>
-            <w:pPr>
-              <w:spacing w:after="0" w:before="0"/>
-            </w:pPr>
-            <w:r>
-              <w:rPr>
-                <w:sz w:val="20"/>
-              </w:rPr>
-            </w:r>
-          </w:p>
-        </w:tc>
-        <w:tc>
-          <w:tcPr>
-            <w:tcW w:type="dxa" w:w="3572"/>
-            <w:tcBorders>
-              <w:top w:val="single" w:sz="6" w:color="002D6A" w:space="0"/>
-              <w:left w:val="single" w:sz="6" w:color="002D6A" w:space="0"/>
-              <w:bottom w:val="single" w:sz="6" w:color="002D6A" w:space="0"/>
-              <w:right w:val="single" w:sz="6" w:color="002D6A" w:space="0"/>
-            </w:tcBorders>
-            <w:vAlign w:val="center"/>
-          </w:tcPr>
-          <w:p>
-            <w:pPr>
-              <w:spacing w:after="0" w:before="0"/>
-            </w:pPr>
-            <w:r>
-              <w:rPr>
-                <w:sz w:val="20"/>
-              </w:rPr>
-            </w:r>
-          </w:p>
-        </w:tc>
-        <w:tc>
-          <w:tcPr>
-            <w:tcW w:type="dxa" w:w="2268"/>
-            <w:tcBorders>
-              <w:top w:val="single" w:sz="6" w:color="002D6A" w:space="0"/>
-              <w:left w:val="single" w:sz="6" w:color="002D6A" w:space="0"/>
-              <w:bottom w:val="single" w:sz="6" w:color="002D6A" w:space="0"/>
-              <w:right w:val="single" w:sz="6" w:color="002D6A" w:space="0"/>
-            </w:tcBorders>
-            <w:vAlign w:val="center"/>
-          </w:tcPr>
-          <w:p>
-            <w:pPr>
-              <w:spacing w:after="0" w:before="0"/>
-            </w:pPr>
-            <w:r>
-              <w:rPr>
-                <w:sz w:val="20"/>
-              </w:rPr>
-            </w:r>
-          </w:p>
-        </w:tc>
-      </w:tr>
-    </w:tbl>
-    <w:p>
-      <w:pPr>
-        <w:spacing w:after="0" w:before="0" w:lineRule="exact" w:line="160"/>
-      </w:pPr>
-    </w:p>
-    <w:p>
-      <w:pPr>
-        <w:spacing w:after="120" w:before="0"/>
-      </w:pPr>
-      <w:r>
-        <w:rPr>
-          <w:b/>
-        </w:rPr>
-        <w:t>How long?</w:t>
-      </w:r>
-      <w:r>
-        <w:t xml:space="preserve"> One tiny image took me </w:t>
-      </w:r>
-      <w:r>
-        <w:t>______________</w:t>
-      </w:r>
-      <w:r>
-        <w:t xml:space="preserve"> minutes. The real photos are 640 by 640, which is 409 600 pixels each, and there are 37 of them. Roughly how long by hand? </w:t>
-      </w:r>
-      <w:r>
-        <w:t>______________________</w:t>
-      </w:r>
-    </w:p>
-    <w:p>
-      <w:pPr>
-        <w:spacing w:after="60" w:before="0"/>
-      </w:pPr>
-      <w:r>
-        <w:rPr>
-          <w:b/>
-        </w:rPr>
-        <w:t>So what should we get the computer to do?</w:t>
-      </w:r>
-    </w:p>
-    <w:tbl>
-      <w:tblPr>
-        <w:tblW w:type="dxa" w:w="10206"/>
-        <w:jc w:val="center"/>
-        <w:tblLayout w:type="fixed"/>
-        <w:tblLook w:firstColumn="1" w:firstRow="1" w:lastColumn="0" w:lastRow="0" w:noHBand="0" w:noVBand="1" w:val="04A0"/>
-        <w:tblLayout w:type="fixed"/>
-      </w:tblPr>
-      <w:tblGrid>
-        <w:gridCol w:w="10206"/>
-      </w:tblGrid>
-      <w:tr>
-        <w:trPr>
-          <w:trHeight w:val="624" w:hRule="exact"/>
-          <w:cantSplit/>
-        </w:trPr>
-        <w:tc>
-          <w:tcPr>
-            <w:tcW w:type="dxa" w:w="10205"/>
-            <w:tcBorders>
-              <w:top w:val="single" w:sz="8" w:color="002D6A" w:space="0"/>
-              <w:left w:val="single" w:sz="8" w:color="002D6A" w:space="0"/>
-              <w:bottom w:val="single" w:space="0" w:sz="4" w:color="9DB0C8"/>
-              <w:right w:val="single" w:sz="8" w:color="002D6A" w:space="0"/>
-            </w:tcBorders>
-          </w:tcPr>
-          <w:p>
-            <w:pPr>
-              <w:spacing w:after="0" w:before="0"/>
-            </w:pPr>
-          </w:p>
-        </w:tc>
-      </w:tr>
-      <w:tr>
-        <w:trPr>
-          <w:trHeight w:val="624" w:hRule="exact"/>
-          <w:cantSplit/>
-        </w:trPr>
-        <w:tc>
-          <w:tcPr>
-            <w:tcW w:type="dxa" w:w="10205"/>
-            <w:tcBorders>
-              <w:top w:val="nil" w:space="0"/>
-              <w:left w:val="single" w:sz="8" w:color="002D6A" w:space="0"/>
-              <w:bottom w:val="single" w:sz="8" w:color="002D6A" w:space="0"/>
-              <w:right w:val="single" w:sz="8" w:color="002D6A" w:space="0"/>
-            </w:tcBorders>
-          </w:tcPr>
-          <w:p>
-            <w:pPr>
-              <w:spacing w:after="0" w:before="0"/>
-            </w:pPr>
-          </w:p>
-        </w:tc>
-      </w:tr>
-    </w:tbl>
-    <w:p>
-      <w:pPr>
-        <w:spacing w:after="0" w:before="0" w:lineRule="exact" w:line="120"/>
-      </w:pPr>
+        <w:t>By hand, one photo has 409 600 red numbers to add up, and there are 37 photos. So we let the computer do it: you will write three small functions.</w:t>
+      </w:r>
     </w:p>
     <w:p>
       <w:pPr>
@@ -10262,7 +8761,7 @@
           <w:sz w:val="20"/>
           <w:shd w:val="clear" w:color="auto" w:fill="EEF2F7"/>
         </w:rPr>
-        <w:t>image_starter.py</w:t>
+        <w:t>cow_message_starter.py</w:t>
       </w:r>
       <w:r>
         <w:t xml:space="preserve">. </w:t>
@@ -10285,7 +8784,7 @@
         <w:t>cow-demo.jpg</w:t>
       </w:r>
       <w:r>
-        <w:t>, then draws a colour.</w:t>
+        <w:t>. Nothing is drawn.</w:t>
       </w:r>
     </w:p>
     <w:p>
@@ -11440,7 +9939,7 @@
                 <w:rFonts w:ascii="Courier New" w:hAnsi="Courier New" w:eastAsia="Courier New" w:cs="Courier New"/>
                 <w:sz w:val="19"/>
               </w:rPr>
-              <w:t xml:space="preserve">    # 1. find the picture: image_path(number)</w:t>
+              <w:t xml:space="preserve">    # 1. find the photo: image_path(number)</w:t>
             </w:r>
           </w:p>
           <w:p>
@@ -13493,8 +11992,58 @@
         <w:spacing w:after="0" w:before="0" w:lineRule="exact" w:line="120"/>
       </w:pPr>
     </w:p>
+    <w:p>
+      <w:pPr>
+        <w:pageBreakBefore/>
+        <w:spacing w:after="0" w:before="0" w:lineRule="exact" w:line="20"/>
+      </w:pPr>
+      <w:r>
+        <w:rPr>
+          <w:sz w:val="2"/>
+        </w:rPr>
+      </w:r>
+    </w:p>
+    <w:p>
+      <w:pPr>
+        <w:jc w:val="center"/>
+      </w:pPr>
+      <w:r>
+        <w:drawing>
+          <wp:inline xmlns:a="http://schemas.openxmlformats.org/drawingml/2006/main" xmlns:pic="http://schemas.openxmlformats.org/drawingml/2006/picture">
+            <wp:extent cx="6480000" cy="7182794"/>
+            <wp:docPr id="1" name="Picture 1"/>
+            <wp:cNvGraphicFramePr>
+              <a:graphicFrameLocks noChangeAspect="1"/>
+            </wp:cNvGraphicFramePr>
+            <a:graphic>
+              <a:graphicData uri="http://schemas.openxmlformats.org/drawingml/2006/picture">
+                <pic:pic>
+                  <pic:nvPicPr>
+                    <pic:cNvPr id="0" name="ans-12.png"/>
+                    <pic:cNvPicPr/>
+                  </pic:nvPicPr>
+                  <pic:blipFill>
+                    <a:blip r:embed="rId9"/>
+                    <a:stretch>
+                      <a:fillRect/>
+                    </a:stretch>
+                  </pic:blipFill>
+                  <pic:spPr>
+                    <a:xfrm>
+                      <a:off x="0" y="0"/>
+                      <a:ext cx="6480000" cy="7182794"/>
+                    </a:xfrm>
+                    <a:prstGeom prst="rect"/>
+                  </pic:spPr>
+                </pic:pic>
+              </a:graphicData>
+            </a:graphic>
+          </wp:inline>
+        </w:drawing>
+      </w:r>
+    </w:p>
     <w:sectPr>
-      <w:footerReference w:type="default" r:id="rId9"/>
+      <w:footerReference w:type="default" r:id="rId10"/>
       <w:pgSz w:w="11906" w:h="16838"/>
       <w:pgMar w:top="794" w:right="850" w:bottom="907" w:left="850" w:header="720" w:footer="454" w:gutter="0"/>
       <w:cols w:space="720"/>

</xml_diff>